<commit_message>
Update: dọn bản nộp và cập nhật mật khẩu báo cáo
</commit_message>
<xml_diff>
--- a/output/docx/bao_cao_hexudon.docx
+++ b/output/docx/bao_cao_hexudon.docx
@@ -301,7 +301,7 @@
         <w:jc w:val="center"/>
       </w:pPr>
       <w:r>
-        <w:t>Tên đăng nhập: phenikaa_2 ; Mật khẩu: procon_2026</w:t>
+        <w:t>Tên đăng nhập: phenikaa_2 ; Mật khẩu: Phenikaa_2</w:t>
       </w:r>
     </w:p>
     <w:p>
@@ -388,7 +388,7 @@
       <w:r>
         <w:fldChar w:fldCharType="separate"/>
       </w:r>
-      <w:hyperlink w:anchor="_Toc243414752" w:history="1">
+      <w:hyperlink w:anchor="_Toc243415460" w:history="1">
         <w:r>
           <w:rPr>
             <w:rStyle w:val="Hyperlink"/>
@@ -415,7 +415,7 @@
             <w:noProof/>
             <w:webHidden/>
           </w:rPr>
-          <w:instrText xml:space="preserve"> PAGEREF _Toc243414752 \h </w:instrText>
+          <w:instrText xml:space="preserve"> PAGEREF _Toc243415460 \h </w:instrText>
         </w:r>
         <w:r>
           <w:rPr>
@@ -462,7 +462,7 @@
           <w14:ligatures w14:val="standardContextual"/>
         </w:rPr>
       </w:pPr>
-      <w:hyperlink w:anchor="_Toc243414753" w:history="1">
+      <w:hyperlink w:anchor="_Toc243415461" w:history="1">
         <w:r>
           <w:rPr>
             <w:rStyle w:val="Hyperlink"/>
@@ -489,7 +489,7 @@
             <w:noProof/>
             <w:webHidden/>
           </w:rPr>
-          <w:instrText xml:space="preserve"> PAGEREF _Toc243414753 \h </w:instrText>
+          <w:instrText xml:space="preserve"> PAGEREF _Toc243415461 \h </w:instrText>
         </w:r>
         <w:r>
           <w:rPr>
@@ -536,7 +536,7 @@
           <w14:ligatures w14:val="standardContextual"/>
         </w:rPr>
       </w:pPr>
-      <w:hyperlink w:anchor="_Toc243414754" w:history="1">
+      <w:hyperlink w:anchor="_Toc243415462" w:history="1">
         <w:r>
           <w:rPr>
             <w:rStyle w:val="Hyperlink"/>
@@ -563,7 +563,7 @@
             <w:noProof/>
             <w:webHidden/>
           </w:rPr>
-          <w:instrText xml:space="preserve"> PAGEREF _Toc243414754 \h </w:instrText>
+          <w:instrText xml:space="preserve"> PAGEREF _Toc243415462 \h </w:instrText>
         </w:r>
         <w:r>
           <w:rPr>
@@ -610,7 +610,7 @@
           <w14:ligatures w14:val="standardContextual"/>
         </w:rPr>
       </w:pPr>
-      <w:hyperlink w:anchor="_Toc243414755" w:history="1">
+      <w:hyperlink w:anchor="_Toc243415463" w:history="1">
         <w:r>
           <w:rPr>
             <w:rStyle w:val="Hyperlink"/>
@@ -637,7 +637,7 @@
             <w:noProof/>
             <w:webHidden/>
           </w:rPr>
-          <w:instrText xml:space="preserve"> PAGEREF _Toc243414755 \h </w:instrText>
+          <w:instrText xml:space="preserve"> PAGEREF _Toc243415463 \h </w:instrText>
         </w:r>
         <w:r>
           <w:rPr>
@@ -684,7 +684,7 @@
           <w14:ligatures w14:val="standardContextual"/>
         </w:rPr>
       </w:pPr>
-      <w:hyperlink w:anchor="_Toc243414756" w:history="1">
+      <w:hyperlink w:anchor="_Toc243415464" w:history="1">
         <w:r>
           <w:rPr>
             <w:rStyle w:val="Hyperlink"/>
@@ -711,7 +711,7 @@
             <w:noProof/>
             <w:webHidden/>
           </w:rPr>
-          <w:instrText xml:space="preserve"> PAGEREF _Toc243414756 \h </w:instrText>
+          <w:instrText xml:space="preserve"> PAGEREF _Toc243415464 \h </w:instrText>
         </w:r>
         <w:r>
           <w:rPr>
@@ -757,7 +757,7 @@
           <w14:ligatures w14:val="standardContextual"/>
         </w:rPr>
       </w:pPr>
-      <w:hyperlink w:anchor="_Toc243414757" w:history="1">
+      <w:hyperlink w:anchor="_Toc243415465" w:history="1">
         <w:r>
           <w:rPr>
             <w:rStyle w:val="Hyperlink"/>
@@ -784,7 +784,7 @@
             <w:noProof/>
             <w:webHidden/>
           </w:rPr>
-          <w:instrText xml:space="preserve"> PAGEREF _Toc243414757 \h </w:instrText>
+          <w:instrText xml:space="preserve"> PAGEREF _Toc243415465 \h </w:instrText>
         </w:r>
         <w:r>
           <w:rPr>
@@ -831,7 +831,7 @@
           <w14:ligatures w14:val="standardContextual"/>
         </w:rPr>
       </w:pPr>
-      <w:hyperlink w:anchor="_Toc243414758" w:history="1">
+      <w:hyperlink w:anchor="_Toc243415466" w:history="1">
         <w:r>
           <w:rPr>
             <w:rStyle w:val="Hyperlink"/>
@@ -858,7 +858,7 @@
             <w:noProof/>
             <w:webHidden/>
           </w:rPr>
-          <w:instrText xml:space="preserve"> PAGEREF _Toc243414758 \h </w:instrText>
+          <w:instrText xml:space="preserve"> PAGEREF _Toc243415466 \h </w:instrText>
         </w:r>
         <w:r>
           <w:rPr>
@@ -905,7 +905,7 @@
           <w14:ligatures w14:val="standardContextual"/>
         </w:rPr>
       </w:pPr>
-      <w:hyperlink w:anchor="_Toc243414759" w:history="1">
+      <w:hyperlink w:anchor="_Toc243415467" w:history="1">
         <w:r>
           <w:rPr>
             <w:rStyle w:val="Hyperlink"/>
@@ -932,7 +932,7 @@
             <w:noProof/>
             <w:webHidden/>
           </w:rPr>
-          <w:instrText xml:space="preserve"> PAGEREF _Toc243414759 \h </w:instrText>
+          <w:instrText xml:space="preserve"> PAGEREF _Toc243415467 \h </w:instrText>
         </w:r>
         <w:r>
           <w:rPr>
@@ -979,7 +979,7 @@
           <w14:ligatures w14:val="standardContextual"/>
         </w:rPr>
       </w:pPr>
-      <w:hyperlink w:anchor="_Toc243414760" w:history="1">
+      <w:hyperlink w:anchor="_Toc243415468" w:history="1">
         <w:r>
           <w:rPr>
             <w:rStyle w:val="Hyperlink"/>
@@ -1006,7 +1006,7 @@
             <w:noProof/>
             <w:webHidden/>
           </w:rPr>
-          <w:instrText xml:space="preserve"> PAGEREF _Toc243414760 \h </w:instrText>
+          <w:instrText xml:space="preserve"> PAGEREF _Toc243415468 \h </w:instrText>
         </w:r>
         <w:r>
           <w:rPr>
@@ -1053,7 +1053,7 @@
           <w14:ligatures w14:val="standardContextual"/>
         </w:rPr>
       </w:pPr>
-      <w:hyperlink w:anchor="_Toc243414761" w:history="1">
+      <w:hyperlink w:anchor="_Toc243415469" w:history="1">
         <w:r>
           <w:rPr>
             <w:rStyle w:val="Hyperlink"/>
@@ -1080,7 +1080,7 @@
             <w:noProof/>
             <w:webHidden/>
           </w:rPr>
-          <w:instrText xml:space="preserve"> PAGEREF _Toc243414761 \h </w:instrText>
+          <w:instrText xml:space="preserve"> PAGEREF _Toc243415469 \h </w:instrText>
         </w:r>
         <w:r>
           <w:rPr>
@@ -1127,7 +1127,7 @@
           <w14:ligatures w14:val="standardContextual"/>
         </w:rPr>
       </w:pPr>
-      <w:hyperlink w:anchor="_Toc243414762" w:history="1">
+      <w:hyperlink w:anchor="_Toc243415470" w:history="1">
         <w:r>
           <w:rPr>
             <w:rStyle w:val="Hyperlink"/>
@@ -1154,7 +1154,7 @@
             <w:noProof/>
             <w:webHidden/>
           </w:rPr>
-          <w:instrText xml:space="preserve"> PAGEREF _Toc243414762 \h </w:instrText>
+          <w:instrText xml:space="preserve"> PAGEREF _Toc243415470 \h </w:instrText>
         </w:r>
         <w:r>
           <w:rPr>
@@ -1200,7 +1200,7 @@
           <w14:ligatures w14:val="standardContextual"/>
         </w:rPr>
       </w:pPr>
-      <w:hyperlink w:anchor="_Toc243414763" w:history="1">
+      <w:hyperlink w:anchor="_Toc243415471" w:history="1">
         <w:r>
           <w:rPr>
             <w:rStyle w:val="Hyperlink"/>
@@ -1227,7 +1227,7 @@
             <w:noProof/>
             <w:webHidden/>
           </w:rPr>
-          <w:instrText xml:space="preserve"> PAGEREF _Toc243414763 \h </w:instrText>
+          <w:instrText xml:space="preserve"> PAGEREF _Toc243415471 \h </w:instrText>
         </w:r>
         <w:r>
           <w:rPr>
@@ -1274,7 +1274,7 @@
           <w14:ligatures w14:val="standardContextual"/>
         </w:rPr>
       </w:pPr>
-      <w:hyperlink w:anchor="_Toc243414764" w:history="1">
+      <w:hyperlink w:anchor="_Toc243415472" w:history="1">
         <w:r>
           <w:rPr>
             <w:rStyle w:val="Hyperlink"/>
@@ -1301,7 +1301,7 @@
             <w:noProof/>
             <w:webHidden/>
           </w:rPr>
-          <w:instrText xml:space="preserve"> PAGEREF _Toc243414764 \h </w:instrText>
+          <w:instrText xml:space="preserve"> PAGEREF _Toc243415472 \h </w:instrText>
         </w:r>
         <w:r>
           <w:rPr>
@@ -1348,7 +1348,7 @@
           <w14:ligatures w14:val="standardContextual"/>
         </w:rPr>
       </w:pPr>
-      <w:hyperlink w:anchor="_Toc243414765" w:history="1">
+      <w:hyperlink w:anchor="_Toc243415473" w:history="1">
         <w:r>
           <w:rPr>
             <w:rStyle w:val="Hyperlink"/>
@@ -1375,7 +1375,7 @@
             <w:noProof/>
             <w:webHidden/>
           </w:rPr>
-          <w:instrText xml:space="preserve"> PAGEREF _Toc243414765 \h </w:instrText>
+          <w:instrText xml:space="preserve"> PAGEREF _Toc243415473 \h </w:instrText>
         </w:r>
         <w:r>
           <w:rPr>
@@ -1422,7 +1422,7 @@
           <w14:ligatures w14:val="standardContextual"/>
         </w:rPr>
       </w:pPr>
-      <w:hyperlink w:anchor="_Toc243414766" w:history="1">
+      <w:hyperlink w:anchor="_Toc243415474" w:history="1">
         <w:r>
           <w:rPr>
             <w:rStyle w:val="Hyperlink"/>
@@ -1449,7 +1449,7 @@
             <w:noProof/>
             <w:webHidden/>
           </w:rPr>
-          <w:instrText xml:space="preserve"> PAGEREF _Toc243414766 \h </w:instrText>
+          <w:instrText xml:space="preserve"> PAGEREF _Toc243415474 \h </w:instrText>
         </w:r>
         <w:r>
           <w:rPr>
@@ -1496,7 +1496,7 @@
           <w14:ligatures w14:val="standardContextual"/>
         </w:rPr>
       </w:pPr>
-      <w:hyperlink w:anchor="_Toc243414767" w:history="1">
+      <w:hyperlink w:anchor="_Toc243415475" w:history="1">
         <w:r>
           <w:rPr>
             <w:rStyle w:val="Hyperlink"/>
@@ -1523,7 +1523,7 @@
             <w:noProof/>
             <w:webHidden/>
           </w:rPr>
-          <w:instrText xml:space="preserve"> PAGEREF _Toc243414767 \h </w:instrText>
+          <w:instrText xml:space="preserve"> PAGEREF _Toc243415475 \h </w:instrText>
         </w:r>
         <w:r>
           <w:rPr>
@@ -1570,7 +1570,7 @@
           <w14:ligatures w14:val="standardContextual"/>
         </w:rPr>
       </w:pPr>
-      <w:hyperlink w:anchor="_Toc243414768" w:history="1">
+      <w:hyperlink w:anchor="_Toc243415476" w:history="1">
         <w:r>
           <w:rPr>
             <w:rStyle w:val="Hyperlink"/>
@@ -1597,7 +1597,7 @@
             <w:noProof/>
             <w:webHidden/>
           </w:rPr>
-          <w:instrText xml:space="preserve"> PAGEREF _Toc243414768 \h </w:instrText>
+          <w:instrText xml:space="preserve"> PAGEREF _Toc243415476 \h </w:instrText>
         </w:r>
         <w:r>
           <w:rPr>
@@ -1643,7 +1643,7 @@
           <w14:ligatures w14:val="standardContextual"/>
         </w:rPr>
       </w:pPr>
-      <w:hyperlink w:anchor="_Toc243414769" w:history="1">
+      <w:hyperlink w:anchor="_Toc243415477" w:history="1">
         <w:r>
           <w:rPr>
             <w:rStyle w:val="Hyperlink"/>
@@ -1670,7 +1670,7 @@
             <w:noProof/>
             <w:webHidden/>
           </w:rPr>
-          <w:instrText xml:space="preserve"> PAGEREF _Toc243414769 \h </w:instrText>
+          <w:instrText xml:space="preserve"> PAGEREF _Toc243415477 \h </w:instrText>
         </w:r>
         <w:r>
           <w:rPr>
@@ -1717,7 +1717,7 @@
           <w14:ligatures w14:val="standardContextual"/>
         </w:rPr>
       </w:pPr>
-      <w:hyperlink w:anchor="_Toc243414770" w:history="1">
+      <w:hyperlink w:anchor="_Toc243415478" w:history="1">
         <w:r>
           <w:rPr>
             <w:rStyle w:val="Hyperlink"/>
@@ -1744,7 +1744,7 @@
             <w:noProof/>
             <w:webHidden/>
           </w:rPr>
-          <w:instrText xml:space="preserve"> PAGEREF _Toc243414770 \h </w:instrText>
+          <w:instrText xml:space="preserve"> PAGEREF _Toc243415478 \h </w:instrText>
         </w:r>
         <w:r>
           <w:rPr>
@@ -1791,7 +1791,7 @@
           <w14:ligatures w14:val="standardContextual"/>
         </w:rPr>
       </w:pPr>
-      <w:hyperlink w:anchor="_Toc243414771" w:history="1">
+      <w:hyperlink w:anchor="_Toc243415479" w:history="1">
         <w:r>
           <w:rPr>
             <w:rStyle w:val="Hyperlink"/>
@@ -1818,7 +1818,7 @@
             <w:noProof/>
             <w:webHidden/>
           </w:rPr>
-          <w:instrText xml:space="preserve"> PAGEREF _Toc243414771 \h </w:instrText>
+          <w:instrText xml:space="preserve"> PAGEREF _Toc243415479 \h </w:instrText>
         </w:r>
         <w:r>
           <w:rPr>
@@ -1865,7 +1865,7 @@
           <w14:ligatures w14:val="standardContextual"/>
         </w:rPr>
       </w:pPr>
-      <w:hyperlink w:anchor="_Toc243414772" w:history="1">
+      <w:hyperlink w:anchor="_Toc243415480" w:history="1">
         <w:r>
           <w:rPr>
             <w:rStyle w:val="Hyperlink"/>
@@ -1892,7 +1892,7 @@
             <w:noProof/>
             <w:webHidden/>
           </w:rPr>
-          <w:instrText xml:space="preserve"> PAGEREF _Toc243414772 \h </w:instrText>
+          <w:instrText xml:space="preserve"> PAGEREF _Toc243415480 \h </w:instrText>
         </w:r>
         <w:r>
           <w:rPr>
@@ -1939,7 +1939,7 @@
           <w14:ligatures w14:val="standardContextual"/>
         </w:rPr>
       </w:pPr>
-      <w:hyperlink w:anchor="_Toc243414773" w:history="1">
+      <w:hyperlink w:anchor="_Toc243415481" w:history="1">
         <w:r>
           <w:rPr>
             <w:rStyle w:val="Hyperlink"/>
@@ -1966,7 +1966,7 @@
             <w:noProof/>
             <w:webHidden/>
           </w:rPr>
-          <w:instrText xml:space="preserve"> PAGEREF _Toc243414773 \h </w:instrText>
+          <w:instrText xml:space="preserve"> PAGEREF _Toc243415481 \h </w:instrText>
         </w:r>
         <w:r>
           <w:rPr>
@@ -2013,7 +2013,7 @@
           <w14:ligatures w14:val="standardContextual"/>
         </w:rPr>
       </w:pPr>
-      <w:hyperlink w:anchor="_Toc243414774" w:history="1">
+      <w:hyperlink w:anchor="_Toc243415482" w:history="1">
         <w:r>
           <w:rPr>
             <w:rStyle w:val="Hyperlink"/>
@@ -2040,7 +2040,7 @@
             <w:noProof/>
             <w:webHidden/>
           </w:rPr>
-          <w:instrText xml:space="preserve"> PAGEREF _Toc243414774 \h </w:instrText>
+          <w:instrText xml:space="preserve"> PAGEREF _Toc243415482 \h </w:instrText>
         </w:r>
         <w:r>
           <w:rPr>
@@ -2087,7 +2087,7 @@
           <w14:ligatures w14:val="standardContextual"/>
         </w:rPr>
       </w:pPr>
-      <w:hyperlink w:anchor="_Toc243414775" w:history="1">
+      <w:hyperlink w:anchor="_Toc243415483" w:history="1">
         <w:r>
           <w:rPr>
             <w:rStyle w:val="Hyperlink"/>
@@ -2114,7 +2114,7 @@
             <w:noProof/>
             <w:webHidden/>
           </w:rPr>
-          <w:instrText xml:space="preserve"> PAGEREF _Toc243414775 \h </w:instrText>
+          <w:instrText xml:space="preserve"> PAGEREF _Toc243415483 \h </w:instrText>
         </w:r>
         <w:r>
           <w:rPr>
@@ -2161,7 +2161,7 @@
           <w14:ligatures w14:val="standardContextual"/>
         </w:rPr>
       </w:pPr>
-      <w:hyperlink w:anchor="_Toc243414776" w:history="1">
+      <w:hyperlink w:anchor="_Toc243415484" w:history="1">
         <w:r>
           <w:rPr>
             <w:rStyle w:val="Hyperlink"/>
@@ -2188,7 +2188,7 @@
             <w:noProof/>
             <w:webHidden/>
           </w:rPr>
-          <w:instrText xml:space="preserve"> PAGEREF _Toc243414776 \h </w:instrText>
+          <w:instrText xml:space="preserve"> PAGEREF _Toc243415484 \h </w:instrText>
         </w:r>
         <w:r>
           <w:rPr>
@@ -2235,7 +2235,7 @@
           <w14:ligatures w14:val="standardContextual"/>
         </w:rPr>
       </w:pPr>
-      <w:hyperlink w:anchor="_Toc243414777" w:history="1">
+      <w:hyperlink w:anchor="_Toc243415485" w:history="1">
         <w:r>
           <w:rPr>
             <w:rStyle w:val="Hyperlink"/>
@@ -2262,7 +2262,7 @@
             <w:noProof/>
             <w:webHidden/>
           </w:rPr>
-          <w:instrText xml:space="preserve"> PAGEREF _Toc243414777 \h </w:instrText>
+          <w:instrText xml:space="preserve"> PAGEREF _Toc243415485 \h </w:instrText>
         </w:r>
         <w:r>
           <w:rPr>
@@ -2308,7 +2308,7 @@
           <w14:ligatures w14:val="standardContextual"/>
         </w:rPr>
       </w:pPr>
-      <w:hyperlink w:anchor="_Toc243414778" w:history="1">
+      <w:hyperlink w:anchor="_Toc243415486" w:history="1">
         <w:r>
           <w:rPr>
             <w:rStyle w:val="Hyperlink"/>
@@ -2335,7 +2335,7 @@
             <w:noProof/>
             <w:webHidden/>
           </w:rPr>
-          <w:instrText xml:space="preserve"> PAGEREF _Toc243414778 \h </w:instrText>
+          <w:instrText xml:space="preserve"> PAGEREF _Toc243415486 \h </w:instrText>
         </w:r>
         <w:r>
           <w:rPr>
@@ -2382,7 +2382,7 @@
           <w14:ligatures w14:val="standardContextual"/>
         </w:rPr>
       </w:pPr>
-      <w:hyperlink w:anchor="_Toc243414779" w:history="1">
+      <w:hyperlink w:anchor="_Toc243415487" w:history="1">
         <w:r>
           <w:rPr>
             <w:rStyle w:val="Hyperlink"/>
@@ -2409,7 +2409,7 @@
             <w:noProof/>
             <w:webHidden/>
           </w:rPr>
-          <w:instrText xml:space="preserve"> PAGEREF _Toc243414779 \h </w:instrText>
+          <w:instrText xml:space="preserve"> PAGEREF _Toc243415487 \h </w:instrText>
         </w:r>
         <w:r>
           <w:rPr>
@@ -2456,7 +2456,7 @@
           <w14:ligatures w14:val="standardContextual"/>
         </w:rPr>
       </w:pPr>
-      <w:hyperlink w:anchor="_Toc243414780" w:history="1">
+      <w:hyperlink w:anchor="_Toc243415488" w:history="1">
         <w:r>
           <w:rPr>
             <w:rStyle w:val="Hyperlink"/>
@@ -2483,7 +2483,7 @@
             <w:noProof/>
             <w:webHidden/>
           </w:rPr>
-          <w:instrText xml:space="preserve"> PAGEREF _Toc243414780 \h </w:instrText>
+          <w:instrText xml:space="preserve"> PAGEREF _Toc243415488 \h </w:instrText>
         </w:r>
         <w:r>
           <w:rPr>
@@ -2530,7 +2530,7 @@
           <w14:ligatures w14:val="standardContextual"/>
         </w:rPr>
       </w:pPr>
-      <w:hyperlink w:anchor="_Toc243414781" w:history="1">
+      <w:hyperlink w:anchor="_Toc243415489" w:history="1">
         <w:r>
           <w:rPr>
             <w:rStyle w:val="Hyperlink"/>
@@ -2557,7 +2557,7 @@
             <w:noProof/>
             <w:webHidden/>
           </w:rPr>
-          <w:instrText xml:space="preserve"> PAGEREF _Toc243414781 \h </w:instrText>
+          <w:instrText xml:space="preserve"> PAGEREF _Toc243415489 \h </w:instrText>
         </w:r>
         <w:r>
           <w:rPr>
@@ -2604,7 +2604,7 @@
           <w14:ligatures w14:val="standardContextual"/>
         </w:rPr>
       </w:pPr>
-      <w:hyperlink w:anchor="_Toc243414782" w:history="1">
+      <w:hyperlink w:anchor="_Toc243415490" w:history="1">
         <w:r>
           <w:rPr>
             <w:rStyle w:val="Hyperlink"/>
@@ -2631,7 +2631,7 @@
             <w:noProof/>
             <w:webHidden/>
           </w:rPr>
-          <w:instrText xml:space="preserve"> PAGEREF _Toc243414782 \h </w:instrText>
+          <w:instrText xml:space="preserve"> PAGEREF _Toc243415490 \h </w:instrText>
         </w:r>
         <w:r>
           <w:rPr>
@@ -2677,7 +2677,7 @@
           <w14:ligatures w14:val="standardContextual"/>
         </w:rPr>
       </w:pPr>
-      <w:hyperlink w:anchor="_Toc243414783" w:history="1">
+      <w:hyperlink w:anchor="_Toc243415491" w:history="1">
         <w:r>
           <w:rPr>
             <w:rStyle w:val="Hyperlink"/>
@@ -2704,7 +2704,7 @@
             <w:noProof/>
             <w:webHidden/>
           </w:rPr>
-          <w:instrText xml:space="preserve"> PAGEREF _Toc243414783 \h </w:instrText>
+          <w:instrText xml:space="preserve"> PAGEREF _Toc243415491 \h </w:instrText>
         </w:r>
         <w:r>
           <w:rPr>
@@ -2751,7 +2751,7 @@
           <w14:ligatures w14:val="standardContextual"/>
         </w:rPr>
       </w:pPr>
-      <w:hyperlink w:anchor="_Toc243414784" w:history="1">
+      <w:hyperlink w:anchor="_Toc243415492" w:history="1">
         <w:r>
           <w:rPr>
             <w:rStyle w:val="Hyperlink"/>
@@ -2778,7 +2778,7 @@
             <w:noProof/>
             <w:webHidden/>
           </w:rPr>
-          <w:instrText xml:space="preserve"> PAGEREF _Toc243414784 \h </w:instrText>
+          <w:instrText xml:space="preserve"> PAGEREF _Toc243415492 \h </w:instrText>
         </w:r>
         <w:r>
           <w:rPr>
@@ -2825,7 +2825,7 @@
           <w14:ligatures w14:val="standardContextual"/>
         </w:rPr>
       </w:pPr>
-      <w:hyperlink w:anchor="_Toc243414785" w:history="1">
+      <w:hyperlink w:anchor="_Toc243415493" w:history="1">
         <w:r>
           <w:rPr>
             <w:rStyle w:val="Hyperlink"/>
@@ -2852,7 +2852,7 @@
             <w:noProof/>
             <w:webHidden/>
           </w:rPr>
-          <w:instrText xml:space="preserve"> PAGEREF _Toc243414785 \h </w:instrText>
+          <w:instrText xml:space="preserve"> PAGEREF _Toc243415493 \h </w:instrText>
         </w:r>
         <w:r>
           <w:rPr>
@@ -2899,7 +2899,7 @@
           <w14:ligatures w14:val="standardContextual"/>
         </w:rPr>
       </w:pPr>
-      <w:hyperlink w:anchor="_Toc243414786" w:history="1">
+      <w:hyperlink w:anchor="_Toc243415494" w:history="1">
         <w:r>
           <w:rPr>
             <w:rStyle w:val="Hyperlink"/>
@@ -2926,7 +2926,7 @@
             <w:noProof/>
             <w:webHidden/>
           </w:rPr>
-          <w:instrText xml:space="preserve"> PAGEREF _Toc243414786 \h </w:instrText>
+          <w:instrText xml:space="preserve"> PAGEREF _Toc243415494 \h </w:instrText>
         </w:r>
         <w:r>
           <w:rPr>
@@ -2973,7 +2973,7 @@
           <w14:ligatures w14:val="standardContextual"/>
         </w:rPr>
       </w:pPr>
-      <w:hyperlink w:anchor="_Toc243414787" w:history="1">
+      <w:hyperlink w:anchor="_Toc243415495" w:history="1">
         <w:r>
           <w:rPr>
             <w:rStyle w:val="Hyperlink"/>
@@ -3000,7 +3000,7 @@
             <w:noProof/>
             <w:webHidden/>
           </w:rPr>
-          <w:instrText xml:space="preserve"> PAGEREF _Toc243414787 \h </w:instrText>
+          <w:instrText xml:space="preserve"> PAGEREF _Toc243415495 \h </w:instrText>
         </w:r>
         <w:r>
           <w:rPr>
@@ -3047,7 +3047,7 @@
           <w14:ligatures w14:val="standardContextual"/>
         </w:rPr>
       </w:pPr>
-      <w:hyperlink w:anchor="_Toc243414788" w:history="1">
+      <w:hyperlink w:anchor="_Toc243415496" w:history="1">
         <w:r>
           <w:rPr>
             <w:rStyle w:val="Hyperlink"/>
@@ -3074,7 +3074,7 @@
             <w:noProof/>
             <w:webHidden/>
           </w:rPr>
-          <w:instrText xml:space="preserve"> PAGEREF _Toc243414788 \h </w:instrText>
+          <w:instrText xml:space="preserve"> PAGEREF _Toc243415496 \h </w:instrText>
         </w:r>
         <w:r>
           <w:rPr>
@@ -3120,7 +3120,7 @@
           <w14:ligatures w14:val="standardContextual"/>
         </w:rPr>
       </w:pPr>
-      <w:hyperlink w:anchor="_Toc243414789" w:history="1">
+      <w:hyperlink w:anchor="_Toc243415497" w:history="1">
         <w:r>
           <w:rPr>
             <w:rStyle w:val="Hyperlink"/>
@@ -3147,7 +3147,7 @@
             <w:noProof/>
             <w:webHidden/>
           </w:rPr>
-          <w:instrText xml:space="preserve"> PAGEREF _Toc243414789 \h </w:instrText>
+          <w:instrText xml:space="preserve"> PAGEREF _Toc243415497 \h </w:instrText>
         </w:r>
         <w:r>
           <w:rPr>
@@ -3194,7 +3194,7 @@
           <w14:ligatures w14:val="standardContextual"/>
         </w:rPr>
       </w:pPr>
-      <w:hyperlink w:anchor="_Toc243414790" w:history="1">
+      <w:hyperlink w:anchor="_Toc243415498" w:history="1">
         <w:r>
           <w:rPr>
             <w:rStyle w:val="Hyperlink"/>
@@ -3221,7 +3221,7 @@
             <w:noProof/>
             <w:webHidden/>
           </w:rPr>
-          <w:instrText xml:space="preserve"> PAGEREF _Toc243414790 \h </w:instrText>
+          <w:instrText xml:space="preserve"> PAGEREF _Toc243415498 \h </w:instrText>
         </w:r>
         <w:r>
           <w:rPr>
@@ -3268,7 +3268,7 @@
           <w14:ligatures w14:val="standardContextual"/>
         </w:rPr>
       </w:pPr>
-      <w:hyperlink w:anchor="_Toc243414791" w:history="1">
+      <w:hyperlink w:anchor="_Toc243415499" w:history="1">
         <w:r>
           <w:rPr>
             <w:rStyle w:val="Hyperlink"/>
@@ -3295,7 +3295,7 @@
             <w:noProof/>
             <w:webHidden/>
           </w:rPr>
-          <w:instrText xml:space="preserve"> PAGEREF _Toc243414791 \h </w:instrText>
+          <w:instrText xml:space="preserve"> PAGEREF _Toc243415499 \h </w:instrText>
         </w:r>
         <w:r>
           <w:rPr>
@@ -3342,7 +3342,7 @@
           <w14:ligatures w14:val="standardContextual"/>
         </w:rPr>
       </w:pPr>
-      <w:hyperlink w:anchor="_Toc243414792" w:history="1">
+      <w:hyperlink w:anchor="_Toc243415500" w:history="1">
         <w:r>
           <w:rPr>
             <w:rStyle w:val="Hyperlink"/>
@@ -3369,7 +3369,7 @@
             <w:noProof/>
             <w:webHidden/>
           </w:rPr>
-          <w:instrText xml:space="preserve"> PAGEREF _Toc243414792 \h </w:instrText>
+          <w:instrText xml:space="preserve"> PAGEREF _Toc243415500 \h </w:instrText>
         </w:r>
         <w:r>
           <w:rPr>
@@ -3416,7 +3416,7 @@
           <w14:ligatures w14:val="standardContextual"/>
         </w:rPr>
       </w:pPr>
-      <w:hyperlink w:anchor="_Toc243414793" w:history="1">
+      <w:hyperlink w:anchor="_Toc243415501" w:history="1">
         <w:r>
           <w:rPr>
             <w:rStyle w:val="Hyperlink"/>
@@ -3443,7 +3443,7 @@
             <w:noProof/>
             <w:webHidden/>
           </w:rPr>
-          <w:instrText xml:space="preserve"> PAGEREF _Toc243414793 \h </w:instrText>
+          <w:instrText xml:space="preserve"> PAGEREF _Toc243415501 \h </w:instrText>
         </w:r>
         <w:r>
           <w:rPr>
@@ -3489,7 +3489,7 @@
           <w14:ligatures w14:val="standardContextual"/>
         </w:rPr>
       </w:pPr>
-      <w:hyperlink w:anchor="_Toc243414794" w:history="1">
+      <w:hyperlink w:anchor="_Toc243415502" w:history="1">
         <w:r>
           <w:rPr>
             <w:rStyle w:val="Hyperlink"/>
@@ -3516,7 +3516,7 @@
             <w:noProof/>
             <w:webHidden/>
           </w:rPr>
-          <w:instrText xml:space="preserve"> PAGEREF _Toc243414794 \h </w:instrText>
+          <w:instrText xml:space="preserve"> PAGEREF _Toc243415502 \h </w:instrText>
         </w:r>
         <w:r>
           <w:rPr>
@@ -3562,7 +3562,7 @@
           <w14:ligatures w14:val="standardContextual"/>
         </w:rPr>
       </w:pPr>
-      <w:hyperlink w:anchor="_Toc243414795" w:history="1">
+      <w:hyperlink w:anchor="_Toc243415503" w:history="1">
         <w:r>
           <w:rPr>
             <w:rStyle w:val="Hyperlink"/>
@@ -3589,7 +3589,7 @@
             <w:noProof/>
             <w:webHidden/>
           </w:rPr>
-          <w:instrText xml:space="preserve"> PAGEREF _Toc243414795 \h </w:instrText>
+          <w:instrText xml:space="preserve"> PAGEREF _Toc243415503 \h </w:instrText>
         </w:r>
         <w:r>
           <w:rPr>
@@ -3636,7 +3636,7 @@
           <w14:ligatures w14:val="standardContextual"/>
         </w:rPr>
       </w:pPr>
-      <w:hyperlink w:anchor="_Toc243414796" w:history="1">
+      <w:hyperlink w:anchor="_Toc243415504" w:history="1">
         <w:r>
           <w:rPr>
             <w:rStyle w:val="Hyperlink"/>
@@ -3663,7 +3663,7 @@
             <w:noProof/>
             <w:webHidden/>
           </w:rPr>
-          <w:instrText xml:space="preserve"> PAGEREF _Toc243414796 \h </w:instrText>
+          <w:instrText xml:space="preserve"> PAGEREF _Toc243415504 \h </w:instrText>
         </w:r>
         <w:r>
           <w:rPr>
@@ -3710,7 +3710,7 @@
           <w14:ligatures w14:val="standardContextual"/>
         </w:rPr>
       </w:pPr>
-      <w:hyperlink w:anchor="_Toc243414797" w:history="1">
+      <w:hyperlink w:anchor="_Toc243415505" w:history="1">
         <w:r>
           <w:rPr>
             <w:rStyle w:val="Hyperlink"/>
@@ -3737,7 +3737,7 @@
             <w:noProof/>
             <w:webHidden/>
           </w:rPr>
-          <w:instrText xml:space="preserve"> PAGEREF _Toc243414797 \h </w:instrText>
+          <w:instrText xml:space="preserve"> PAGEREF _Toc243415505 \h </w:instrText>
         </w:r>
         <w:r>
           <w:rPr>
@@ -3783,7 +3783,7 @@
           <w14:ligatures w14:val="standardContextual"/>
         </w:rPr>
       </w:pPr>
-      <w:hyperlink w:anchor="_Toc243414798" w:history="1">
+      <w:hyperlink w:anchor="_Toc243415506" w:history="1">
         <w:r>
           <w:rPr>
             <w:rStyle w:val="Hyperlink"/>
@@ -3810,7 +3810,7 @@
             <w:noProof/>
             <w:webHidden/>
           </w:rPr>
-          <w:instrText xml:space="preserve"> PAGEREF _Toc243414798 \h </w:instrText>
+          <w:instrText xml:space="preserve"> PAGEREF _Toc243415506 \h </w:instrText>
         </w:r>
         <w:r>
           <w:rPr>
@@ -3857,7 +3857,7 @@
           <w14:ligatures w14:val="standardContextual"/>
         </w:rPr>
       </w:pPr>
-      <w:hyperlink w:anchor="_Toc243414799" w:history="1">
+      <w:hyperlink w:anchor="_Toc243415507" w:history="1">
         <w:r>
           <w:rPr>
             <w:rStyle w:val="Hyperlink"/>
@@ -3884,7 +3884,7 @@
             <w:noProof/>
             <w:webHidden/>
           </w:rPr>
-          <w:instrText xml:space="preserve"> PAGEREF _Toc243414799 \h </w:instrText>
+          <w:instrText xml:space="preserve"> PAGEREF _Toc243415507 \h </w:instrText>
         </w:r>
         <w:r>
           <w:rPr>
@@ -3931,7 +3931,7 @@
           <w14:ligatures w14:val="standardContextual"/>
         </w:rPr>
       </w:pPr>
-      <w:hyperlink w:anchor="_Toc243414800" w:history="1">
+      <w:hyperlink w:anchor="_Toc243415508" w:history="1">
         <w:r>
           <w:rPr>
             <w:rStyle w:val="Hyperlink"/>
@@ -3958,7 +3958,7 @@
             <w:noProof/>
             <w:webHidden/>
           </w:rPr>
-          <w:instrText xml:space="preserve"> PAGEREF _Toc243414800 \h </w:instrText>
+          <w:instrText xml:space="preserve"> PAGEREF _Toc243415508 \h </w:instrText>
         </w:r>
         <w:r>
           <w:rPr>
@@ -4005,7 +4005,7 @@
           <w14:ligatures w14:val="standardContextual"/>
         </w:rPr>
       </w:pPr>
-      <w:hyperlink w:anchor="_Toc243414801" w:history="1">
+      <w:hyperlink w:anchor="_Toc243415509" w:history="1">
         <w:r>
           <w:rPr>
             <w:rStyle w:val="Hyperlink"/>
@@ -4032,7 +4032,7 @@
             <w:noProof/>
             <w:webHidden/>
           </w:rPr>
-          <w:instrText xml:space="preserve"> PAGEREF _Toc243414801 \h </w:instrText>
+          <w:instrText xml:space="preserve"> PAGEREF _Toc243415509 \h </w:instrText>
         </w:r>
         <w:r>
           <w:rPr>
@@ -4078,7 +4078,7 @@
           <w14:ligatures w14:val="standardContextual"/>
         </w:rPr>
       </w:pPr>
-      <w:hyperlink w:anchor="_Toc243414802" w:history="1">
+      <w:hyperlink w:anchor="_Toc243415510" w:history="1">
         <w:r>
           <w:rPr>
             <w:rStyle w:val="Hyperlink"/>
@@ -4105,7 +4105,7 @@
             <w:noProof/>
             <w:webHidden/>
           </w:rPr>
-          <w:instrText xml:space="preserve"> PAGEREF _Toc243414802 \h </w:instrText>
+          <w:instrText xml:space="preserve"> PAGEREF _Toc243415510 \h </w:instrText>
         </w:r>
         <w:r>
           <w:rPr>
@@ -4152,7 +4152,7 @@
           <w14:ligatures w14:val="standardContextual"/>
         </w:rPr>
       </w:pPr>
-      <w:hyperlink w:anchor="_Toc243414803" w:history="1">
+      <w:hyperlink w:anchor="_Toc243415511" w:history="1">
         <w:r>
           <w:rPr>
             <w:rStyle w:val="Hyperlink"/>
@@ -4179,7 +4179,7 @@
             <w:noProof/>
             <w:webHidden/>
           </w:rPr>
-          <w:instrText xml:space="preserve"> PAGEREF _Toc243414803 \h </w:instrText>
+          <w:instrText xml:space="preserve"> PAGEREF _Toc243415511 \h </w:instrText>
         </w:r>
         <w:r>
           <w:rPr>
@@ -4226,7 +4226,7 @@
           <w14:ligatures w14:val="standardContextual"/>
         </w:rPr>
       </w:pPr>
-      <w:hyperlink w:anchor="_Toc243414804" w:history="1">
+      <w:hyperlink w:anchor="_Toc243415512" w:history="1">
         <w:r>
           <w:rPr>
             <w:rStyle w:val="Hyperlink"/>
@@ -4253,7 +4253,7 @@
             <w:noProof/>
             <w:webHidden/>
           </w:rPr>
-          <w:instrText xml:space="preserve"> PAGEREF _Toc243414804 \h </w:instrText>
+          <w:instrText xml:space="preserve"> PAGEREF _Toc243415512 \h </w:instrText>
         </w:r>
         <w:r>
           <w:rPr>
@@ -4300,7 +4300,7 @@
           <w14:ligatures w14:val="standardContextual"/>
         </w:rPr>
       </w:pPr>
-      <w:hyperlink w:anchor="_Toc243414805" w:history="1">
+      <w:hyperlink w:anchor="_Toc243415513" w:history="1">
         <w:r>
           <w:rPr>
             <w:rStyle w:val="Hyperlink"/>
@@ -4327,7 +4327,7 @@
             <w:noProof/>
             <w:webHidden/>
           </w:rPr>
-          <w:instrText xml:space="preserve"> PAGEREF _Toc243414805 \h </w:instrText>
+          <w:instrText xml:space="preserve"> PAGEREF _Toc243415513 \h </w:instrText>
         </w:r>
         <w:r>
           <w:rPr>
@@ -4374,7 +4374,7 @@
           <w14:ligatures w14:val="standardContextual"/>
         </w:rPr>
       </w:pPr>
-      <w:hyperlink w:anchor="_Toc243414806" w:history="1">
+      <w:hyperlink w:anchor="_Toc243415514" w:history="1">
         <w:r>
           <w:rPr>
             <w:rStyle w:val="Hyperlink"/>
@@ -4401,7 +4401,7 @@
             <w:noProof/>
             <w:webHidden/>
           </w:rPr>
-          <w:instrText xml:space="preserve"> PAGEREF _Toc243414806 \h </w:instrText>
+          <w:instrText xml:space="preserve"> PAGEREF _Toc243415514 \h </w:instrText>
         </w:r>
         <w:r>
           <w:rPr>
@@ -4448,7 +4448,7 @@
           <w14:ligatures w14:val="standardContextual"/>
         </w:rPr>
       </w:pPr>
-      <w:hyperlink w:anchor="_Toc243414807" w:history="1">
+      <w:hyperlink w:anchor="_Toc243415515" w:history="1">
         <w:r>
           <w:rPr>
             <w:rStyle w:val="Hyperlink"/>
@@ -4475,7 +4475,7 @@
             <w:noProof/>
             <w:webHidden/>
           </w:rPr>
-          <w:instrText xml:space="preserve"> PAGEREF _Toc243414807 \h </w:instrText>
+          <w:instrText xml:space="preserve"> PAGEREF _Toc243415515 \h </w:instrText>
         </w:r>
         <w:r>
           <w:rPr>
@@ -4522,7 +4522,7 @@
           <w14:ligatures w14:val="standardContextual"/>
         </w:rPr>
       </w:pPr>
-      <w:hyperlink w:anchor="_Toc243414808" w:history="1">
+      <w:hyperlink w:anchor="_Toc243415516" w:history="1">
         <w:r>
           <w:rPr>
             <w:rStyle w:val="Hyperlink"/>
@@ -4549,7 +4549,7 @@
             <w:noProof/>
             <w:webHidden/>
           </w:rPr>
-          <w:instrText xml:space="preserve"> PAGEREF _Toc243414808 \h </w:instrText>
+          <w:instrText xml:space="preserve"> PAGEREF _Toc243415516 \h </w:instrText>
         </w:r>
         <w:r>
           <w:rPr>
@@ -4596,7 +4596,7 @@
           <w14:ligatures w14:val="standardContextual"/>
         </w:rPr>
       </w:pPr>
-      <w:hyperlink w:anchor="_Toc243414809" w:history="1">
+      <w:hyperlink w:anchor="_Toc243415517" w:history="1">
         <w:r>
           <w:rPr>
             <w:rStyle w:val="Hyperlink"/>
@@ -4623,7 +4623,7 @@
             <w:noProof/>
             <w:webHidden/>
           </w:rPr>
-          <w:instrText xml:space="preserve"> PAGEREF _Toc243414809 \h </w:instrText>
+          <w:instrText xml:space="preserve"> PAGEREF _Toc243415517 \h </w:instrText>
         </w:r>
         <w:r>
           <w:rPr>
@@ -4670,7 +4670,7 @@
           <w14:ligatures w14:val="standardContextual"/>
         </w:rPr>
       </w:pPr>
-      <w:hyperlink w:anchor="_Toc243414810" w:history="1">
+      <w:hyperlink w:anchor="_Toc243415518" w:history="1">
         <w:r>
           <w:rPr>
             <w:rStyle w:val="Hyperlink"/>
@@ -4697,7 +4697,7 @@
             <w:noProof/>
             <w:webHidden/>
           </w:rPr>
-          <w:instrText xml:space="preserve"> PAGEREF _Toc243414810 \h </w:instrText>
+          <w:instrText xml:space="preserve"> PAGEREF _Toc243415518 \h </w:instrText>
         </w:r>
         <w:r>
           <w:rPr>
@@ -4744,7 +4744,7 @@
           <w14:ligatures w14:val="standardContextual"/>
         </w:rPr>
       </w:pPr>
-      <w:hyperlink w:anchor="_Toc243414811" w:history="1">
+      <w:hyperlink w:anchor="_Toc243415519" w:history="1">
         <w:r>
           <w:rPr>
             <w:rStyle w:val="Hyperlink"/>
@@ -4771,7 +4771,7 @@
             <w:noProof/>
             <w:webHidden/>
           </w:rPr>
-          <w:instrText xml:space="preserve"> PAGEREF _Toc243414811 \h </w:instrText>
+          <w:instrText xml:space="preserve"> PAGEREF _Toc243415519 \h </w:instrText>
         </w:r>
         <w:r>
           <w:rPr>
@@ -4818,7 +4818,7 @@
           <w14:ligatures w14:val="standardContextual"/>
         </w:rPr>
       </w:pPr>
-      <w:hyperlink w:anchor="_Toc243414812" w:history="1">
+      <w:hyperlink w:anchor="_Toc243415520" w:history="1">
         <w:r>
           <w:rPr>
             <w:rStyle w:val="Hyperlink"/>
@@ -4845,7 +4845,7 @@
             <w:noProof/>
             <w:webHidden/>
           </w:rPr>
-          <w:instrText xml:space="preserve"> PAGEREF _Toc243414812 \h </w:instrText>
+          <w:instrText xml:space="preserve"> PAGEREF _Toc243415520 \h </w:instrText>
         </w:r>
         <w:r>
           <w:rPr>
@@ -4892,7 +4892,7 @@
           <w14:ligatures w14:val="standardContextual"/>
         </w:rPr>
       </w:pPr>
-      <w:hyperlink w:anchor="_Toc243414813" w:history="1">
+      <w:hyperlink w:anchor="_Toc243415521" w:history="1">
         <w:r>
           <w:rPr>
             <w:rStyle w:val="Hyperlink"/>
@@ -4919,7 +4919,7 @@
             <w:noProof/>
             <w:webHidden/>
           </w:rPr>
-          <w:instrText xml:space="preserve"> PAGEREF _Toc243414813 \h </w:instrText>
+          <w:instrText xml:space="preserve"> PAGEREF _Toc243415521 \h </w:instrText>
         </w:r>
         <w:r>
           <w:rPr>
@@ -4977,7 +4977,7 @@
         <w:spacing w:before="240"/>
         <w:jc w:val="left"/>
       </w:pPr>
-      <w:bookmarkStart w:id="0" w:name="_Toc243414752"/>
+      <w:bookmarkStart w:id="0" w:name="_Toc243415460"/>
       <w:r>
         <w:lastRenderedPageBreak/>
         <w:t>1. Giới thiệu đề tài</w:t>
@@ -4990,7 +4990,7 @@
         <w:spacing w:before="160"/>
         <w:jc w:val="left"/>
       </w:pPr>
-      <w:bookmarkStart w:id="1" w:name="_Toc243414753"/>
+      <w:bookmarkStart w:id="1" w:name="_Toc243415461"/>
       <w:r>
         <w:t>1.1. Bối cảnh và nhiệm vụ của đội chơi</w:t>
       </w:r>
@@ -5485,7 +5485,7 @@
         <w:spacing w:before="160"/>
         <w:jc w:val="left"/>
       </w:pPr>
-      <w:bookmarkStart w:id="2" w:name="_Toc243414754"/>
+      <w:bookmarkStart w:id="2" w:name="_Toc243415462"/>
       <w:r>
         <w:t>1.2. Động cơ và câu hỏi nghiên cứu</w:t>
       </w:r>
@@ -5507,7 +5507,7 @@
         <w:spacing w:before="160"/>
         <w:jc w:val="left"/>
       </w:pPr>
-      <w:bookmarkStart w:id="3" w:name="_Toc243414755"/>
+      <w:bookmarkStart w:id="3" w:name="_Toc243415463"/>
       <w:r>
         <w:t>1.3. Phạm vi và các sản phẩm đã thực hiện</w:t>
       </w:r>
@@ -5530,7 +5530,7 @@
         <w:spacing w:before="160"/>
         <w:jc w:val="left"/>
       </w:pPr>
-      <w:bookmarkStart w:id="4" w:name="_Toc243414756"/>
+      <w:bookmarkStart w:id="4" w:name="_Toc243415464"/>
       <w:r>
         <w:t>1.4. Cách tổ chức và nguyên tắc đánh giá</w:t>
       </w:r>
@@ -5547,7 +5547,7 @@
         <w:spacing w:before="240"/>
         <w:jc w:val="left"/>
       </w:pPr>
-      <w:bookmarkStart w:id="5" w:name="_Toc243414757"/>
+      <w:bookmarkStart w:id="5" w:name="_Toc243415465"/>
       <w:r>
         <w:t>2. Mô tả đề bài và mô hình tối ưu</w:t>
       </w:r>
@@ -5559,7 +5559,7 @@
         <w:spacing w:before="160"/>
         <w:jc w:val="left"/>
       </w:pPr>
-      <w:bookmarkStart w:id="6" w:name="_Toc243414758"/>
+      <w:bookmarkStart w:id="6" w:name="_Toc243415466"/>
       <w:r>
         <w:t>2.1. Bản đồ, điểm bán và hai loại xe</w:t>
       </w:r>
@@ -6197,7 +6197,7 @@
         <w:spacing w:before="160"/>
         <w:jc w:val="left"/>
       </w:pPr>
-      <w:bookmarkStart w:id="7" w:name="_Toc243414759"/>
+      <w:bookmarkStart w:id="7" w:name="_Toc243415467"/>
       <w:r>
         <w:t>2.2. Thời gian, nhiên liệu và tiến trình một ngày</w:t>
       </w:r>
@@ -6805,7 +6805,7 @@
         <w:spacing w:before="160"/>
         <w:jc w:val="left"/>
       </w:pPr>
-      <w:bookmarkStart w:id="8" w:name="_Toc243414760"/>
+      <w:bookmarkStart w:id="8" w:name="_Toc243415468"/>
       <w:r>
         <w:lastRenderedPageBreak/>
         <w:t>2.3. Dữ liệu đầu vào và ví dụ kế hoạch đầu ra</w:t>
@@ -7408,7 +7408,7 @@
         <w:spacing w:before="160"/>
         <w:jc w:val="left"/>
       </w:pPr>
-      <w:bookmarkStart w:id="9" w:name="_Toc243414761"/>
+      <w:bookmarkStart w:id="9" w:name="_Toc243415469"/>
       <w:r>
         <w:t>2.4. Cách tính điểm và trạng thái đường</w:t>
       </w:r>
@@ -7860,7 +7860,7 @@
         <w:spacing w:before="160"/>
         <w:jc w:val="left"/>
       </w:pPr>
-      <w:bookmarkStart w:id="10" w:name="_Toc243414762"/>
+      <w:bookmarkStart w:id="10" w:name="_Toc243415470"/>
       <w:r>
         <w:t>2.5. Chuyển đề bài thành mô hình đồ thị có tài nguyên</w:t>
       </w:r>
@@ -7882,7 +7882,7 @@
         <w:spacing w:before="240"/>
         <w:jc w:val="left"/>
       </w:pPr>
-      <w:bookmarkStart w:id="11" w:name="_Toc243414763"/>
+      <w:bookmarkStart w:id="11" w:name="_Toc243415471"/>
       <w:r>
         <w:lastRenderedPageBreak/>
         <w:t>3. Các thuật toán tìm đường có ràng buộc tài nguyên</w:t>
@@ -8543,7 +8543,7 @@
         <w:spacing w:before="160"/>
         <w:jc w:val="left"/>
       </w:pPr>
-      <w:bookmarkStart w:id="12" w:name="_Toc243414764"/>
+      <w:bookmarkStart w:id="12" w:name="_Toc243415472"/>
       <w:r>
         <w:t>3.1. Các nhãn trạng thái và quy tắc loại nhãn</w:t>
       </w:r>
@@ -8633,7 +8633,7 @@
         <w:spacing w:before="160"/>
         <w:jc w:val="left"/>
       </w:pPr>
-      <w:bookmarkStart w:id="13" w:name="_Toc243414765"/>
+      <w:bookmarkStart w:id="13" w:name="_Toc243415473"/>
       <w:r>
         <w:t>3.2. DFS và BFS làm đối chứng cấu trúc</w:t>
       </w:r>
@@ -8670,7 +8670,7 @@
         <w:spacing w:before="160"/>
         <w:jc w:val="left"/>
       </w:pPr>
-      <w:bookmarkStart w:id="14" w:name="_Toc243414766"/>
+      <w:bookmarkStart w:id="14" w:name="_Toc243415474"/>
       <w:r>
         <w:lastRenderedPageBreak/>
         <w:t>3.3. Dijkstra theo chi phí thời gian</w:t>
@@ -8703,7 +8703,7 @@
         <w:spacing w:before="160"/>
         <w:jc w:val="left"/>
       </w:pPr>
-      <w:bookmarkStart w:id="15" w:name="_Toc243414767"/>
+      <w:bookmarkStart w:id="15" w:name="_Toc243415475"/>
       <w:r>
         <w:t>3.4. Greedy Best First và A*</w:t>
       </w:r>
@@ -8749,7 +8749,7 @@
         <w:spacing w:before="160"/>
         <w:jc w:val="left"/>
       </w:pPr>
-      <w:bookmarkStart w:id="16" w:name="_Toc243414768"/>
+      <w:bookmarkStart w:id="16" w:name="_Toc243415476"/>
       <w:r>
         <w:t>3.5. Mã giả và độ phức tạp</w:t>
       </w:r>
@@ -8822,7 +8822,7 @@
         <w:pStyle w:val="Heading1"/>
         <w:jc w:val="left"/>
       </w:pPr>
-      <w:bookmarkStart w:id="17" w:name="_Toc243414769"/>
+      <w:bookmarkStart w:id="17" w:name="_Toc243415477"/>
       <w:r>
         <w:t>4. Phương pháp lập tuyến cả đội có ràng buộc tài nguyên</w:t>
       </w:r>
@@ -9284,7 +9284,7 @@
         <w:pStyle w:val="Heading2"/>
         <w:jc w:val="left"/>
       </w:pPr>
-      <w:bookmarkStart w:id="18" w:name="_Toc243414770"/>
+      <w:bookmarkStart w:id="18" w:name="_Toc243415478"/>
       <w:r>
         <w:t>4.1. Dijkstra tạo chặng đi theo step và nhiên liệu</w:t>
       </w:r>
@@ -9311,7 +9311,7 @@
         <w:pStyle w:val="Heading2"/>
         <w:jc w:val="left"/>
       </w:pPr>
-      <w:bookmarkStart w:id="19" w:name="_Toc243414771"/>
+      <w:bookmarkStart w:id="19" w:name="_Toc243415479"/>
       <w:r>
         <w:lastRenderedPageBreak/>
         <w:t>4.2. Chèn tham lam và phối hợp kho giữa các xe</w:t>
@@ -9347,7 +9347,7 @@
         <w:pStyle w:val="Heading2"/>
         <w:jc w:val="left"/>
       </w:pPr>
-      <w:bookmarkStart w:id="20" w:name="_Toc243414772"/>
+      <w:bookmarkStart w:id="20" w:name="_Toc243415480"/>
       <w:r>
         <w:t>4.3. Tìm kiếm cục bộ phá rồi dựng lại</w:t>
       </w:r>
@@ -9374,7 +9374,7 @@
         <w:pStyle w:val="Heading2"/>
         <w:jc w:val="left"/>
       </w:pPr>
-      <w:bookmarkStart w:id="21" w:name="_Toc243414773"/>
+      <w:bookmarkStart w:id="21" w:name="_Toc243415481"/>
       <w:r>
         <w:t>4.4. Phân bổ nhiên liệu và lịch hẹn tiếp tế</w:t>
       </w:r>
@@ -9402,7 +9402,7 @@
         <w:pStyle w:val="Heading2"/>
         <w:jc w:val="left"/>
       </w:pPr>
-      <w:bookmarkStart w:id="22" w:name="_Toc243414774"/>
+      <w:bookmarkStart w:id="22" w:name="_Toc243415482"/>
       <w:r>
         <w:t>4.5. Phủ loại và chuẩn bị vị trí cho ngày tiếp theo</w:t>
       </w:r>
@@ -9429,7 +9429,7 @@
         <w:pStyle w:val="Heading2"/>
         <w:jc w:val="left"/>
       </w:pPr>
-      <w:bookmarkStart w:id="23" w:name="_Toc243414775"/>
+      <w:bookmarkStart w:id="23" w:name="_Toc243415483"/>
       <w:r>
         <w:t>4.6. Chọn vai trò xe bằng mô phỏng</w:t>
       </w:r>
@@ -9456,7 +9456,7 @@
         <w:pStyle w:val="Heading2"/>
         <w:jc w:val="left"/>
       </w:pPr>
-      <w:bookmarkStart w:id="24" w:name="_Toc243414776"/>
+      <w:bookmarkStart w:id="24" w:name="_Toc243415484"/>
       <w:r>
         <w:lastRenderedPageBreak/>
         <w:t>4.7. Ngân sách tính toán và kiểm tra kế hoạch</w:t>
@@ -9484,7 +9484,7 @@
         <w:pStyle w:val="Heading2"/>
         <w:jc w:val="left"/>
       </w:pPr>
-      <w:bookmarkStart w:id="25" w:name="_Toc243414777"/>
+      <w:bookmarkStart w:id="25" w:name="_Toc243415485"/>
       <w:r>
         <w:t>4.8. Cận trên để đánh giá mức đạt được</w:t>
       </w:r>
@@ -9511,7 +9511,7 @@
         <w:pStyle w:val="Heading1"/>
         <w:jc w:val="left"/>
       </w:pPr>
-      <w:bookmarkStart w:id="26" w:name="_Toc243414778"/>
+      <w:bookmarkStart w:id="26" w:name="_Toc243415486"/>
       <w:r>
         <w:t>5. Thiết kế đánh giá và kiểm chứng</w:t>
       </w:r>
@@ -9522,7 +9522,7 @@
         <w:pStyle w:val="Heading2"/>
         <w:jc w:val="left"/>
       </w:pPr>
-      <w:bookmarkStart w:id="27" w:name="_Toc243414779"/>
+      <w:bookmarkStart w:id="27" w:name="_Toc243415487"/>
       <w:r>
         <w:t>5.1. Dữ liệu và phạm vi từng phép đo</w:t>
       </w:r>
@@ -9875,7 +9875,7 @@
         <w:pStyle w:val="Heading2"/>
         <w:jc w:val="left"/>
       </w:pPr>
-      <w:bookmarkStart w:id="28" w:name="_Toc243414780"/>
+      <w:bookmarkStart w:id="28" w:name="_Toc243415488"/>
       <w:r>
         <w:t>5.2. Quy tắc so sánh và thời gian</w:t>
       </w:r>
@@ -9902,7 +9902,7 @@
         <w:pStyle w:val="Heading2"/>
         <w:jc w:val="left"/>
       </w:pPr>
-      <w:bookmarkStart w:id="29" w:name="_Toc243414781"/>
+      <w:bookmarkStart w:id="29" w:name="_Toc243415489"/>
       <w:r>
         <w:t>5.3. Quy trình nộp và lưu nguồn kiểm tra</w:t>
       </w:r>
@@ -9930,7 +9930,7 @@
         <w:pStyle w:val="Heading2"/>
         <w:jc w:val="left"/>
       </w:pPr>
-      <w:bookmarkStart w:id="30" w:name="_Toc243414782"/>
+      <w:bookmarkStart w:id="30" w:name="_Toc243415490"/>
       <w:r>
         <w:t>5.4. Đối chiếu replay và giới hạn bằng chứng</w:t>
       </w:r>
@@ -9957,7 +9957,7 @@
         <w:pStyle w:val="Heading1"/>
         <w:jc w:val="left"/>
       </w:pPr>
-      <w:bookmarkStart w:id="31" w:name="_Toc243414783"/>
+      <w:bookmarkStart w:id="31" w:name="_Toc243415491"/>
       <w:r>
         <w:t>6. Kết quả và phân tích</w:t>
       </w:r>
@@ -9969,7 +9969,7 @@
         <w:spacing w:before="160"/>
         <w:jc w:val="left"/>
       </w:pPr>
-      <w:bookmarkStart w:id="32" w:name="_Toc243414784"/>
+      <w:bookmarkStart w:id="32" w:name="_Toc243415492"/>
       <w:r>
         <w:t>6.1. So sánh năm thuật toán tìm đường</w:t>
       </w:r>
@@ -14026,7 +14026,7 @@
         <w:pStyle w:val="Heading2"/>
         <w:jc w:val="left"/>
       </w:pPr>
-      <w:bookmarkStart w:id="33" w:name="_Toc243414785"/>
+      <w:bookmarkStart w:id="33" w:name="_Toc243415493"/>
       <w:r>
         <w:t>6.2. Điểm máy chủ và các cận trên của phiên bản hiện tại</w:t>
       </w:r>
@@ -14779,7 +14779,7 @@
         <w:pStyle w:val="Heading2"/>
         <w:jc w:val="left"/>
       </w:pPr>
-      <w:bookmarkStart w:id="34" w:name="_Toc243414786"/>
+      <w:bookmarkStart w:id="34" w:name="_Toc243415494"/>
       <w:r>
         <w:t>6.3. Đối chiếu với điểm máy chủ của đội khác</w:t>
       </w:r>
@@ -15696,7 +15696,7 @@
         <w:pStyle w:val="Heading2"/>
         <w:jc w:val="left"/>
       </w:pPr>
-      <w:bookmarkStart w:id="35" w:name="_Toc243414787"/>
+      <w:bookmarkStart w:id="35" w:name="_Toc243415495"/>
       <w:r>
         <w:t>6.4. Thời gian và kết quả đối chiếu replay</w:t>
       </w:r>
@@ -16776,7 +16776,7 @@
         <w:pStyle w:val="Heading2"/>
         <w:jc w:val="left"/>
       </w:pPr>
-      <w:bookmarkStart w:id="36" w:name="_Toc243414788"/>
+      <w:bookmarkStart w:id="36" w:name="_Toc243415496"/>
       <w:r>
         <w:t>6.5. Phân tích một trận đạt đủ loại ở mọi ngày</w:t>
       </w:r>
@@ -17950,7 +17950,7 @@
         <w:pStyle w:val="Heading1"/>
         <w:jc w:val="left"/>
       </w:pPr>
-      <w:bookmarkStart w:id="37" w:name="_Toc243414789"/>
+      <w:bookmarkStart w:id="37" w:name="_Toc243415497"/>
       <w:r>
         <w:lastRenderedPageBreak/>
         <w:t>7. Đánh giá và kết luận</w:t>
@@ -17962,7 +17962,7 @@
         <w:pStyle w:val="Heading2"/>
         <w:jc w:val="left"/>
       </w:pPr>
-      <w:bookmarkStart w:id="38" w:name="_Toc243414790"/>
+      <w:bookmarkStart w:id="38" w:name="_Toc243415498"/>
       <w:r>
         <w:t>7.1. Kết quả đạt được</w:t>
       </w:r>
@@ -17989,7 +17989,7 @@
         <w:pStyle w:val="Heading2"/>
         <w:jc w:val="left"/>
       </w:pPr>
-      <w:bookmarkStart w:id="39" w:name="_Toc243414791"/>
+      <w:bookmarkStart w:id="39" w:name="_Toc243415499"/>
       <w:r>
         <w:t>7.2. Phạm vi và giới hạn</w:t>
       </w:r>
@@ -18016,7 +18016,7 @@
         <w:pStyle w:val="Heading2"/>
         <w:jc w:val="left"/>
       </w:pPr>
-      <w:bookmarkStart w:id="40" w:name="_Toc243414792"/>
+      <w:bookmarkStart w:id="40" w:name="_Toc243415500"/>
       <w:r>
         <w:t>7.3. Hướng phát triển</w:t>
       </w:r>
@@ -18043,7 +18043,7 @@
         <w:pStyle w:val="Heading2"/>
         <w:jc w:val="left"/>
       </w:pPr>
-      <w:bookmarkStart w:id="41" w:name="_Toc243414793"/>
+      <w:bookmarkStart w:id="41" w:name="_Toc243415501"/>
       <w:r>
         <w:lastRenderedPageBreak/>
         <w:t>7.4. Kết luận</w:t>
@@ -18064,7 +18064,7 @@
         <w:spacing w:before="240"/>
         <w:jc w:val="left"/>
       </w:pPr>
-      <w:bookmarkStart w:id="42" w:name="_Toc243414794"/>
+      <w:bookmarkStart w:id="42" w:name="_Toc243415502"/>
       <w:r>
         <w:t>Tài liệu tham khảo</w:t>
       </w:r>
@@ -18161,7 +18161,7 @@
         <w:spacing w:before="240"/>
         <w:jc w:val="left"/>
       </w:pPr>
-      <w:bookmarkStart w:id="43" w:name="_Toc243414795"/>
+      <w:bookmarkStart w:id="43" w:name="_Toc243415503"/>
       <w:r>
         <w:t>Phụ lục A. Luật thực thi và kiểm chứng</w:t>
       </w:r>
@@ -18173,7 +18173,7 @@
         <w:spacing w:before="160"/>
         <w:jc w:val="left"/>
       </w:pPr>
-      <w:bookmarkStart w:id="44" w:name="_Toc243414796"/>
+      <w:bookmarkStart w:id="44" w:name="_Toc243415504"/>
       <w:r>
         <w:t>A.1. Các quy tắc timeline cần giữ nhất quán</w:t>
       </w:r>
@@ -18195,7 +18195,7 @@
         <w:spacing w:before="160"/>
         <w:jc w:val="left"/>
       </w:pPr>
-      <w:bookmarkStart w:id="45" w:name="_Toc243414797"/>
+      <w:bookmarkStart w:id="45" w:name="_Toc243415505"/>
       <w:r>
         <w:t>A.2. Kiểm tra output và phạm vi API</w:t>
       </w:r>
@@ -19224,7 +19224,7 @@
         <w:pStyle w:val="Heading1"/>
         <w:jc w:val="left"/>
       </w:pPr>
-      <w:bookmarkStart w:id="46" w:name="_Toc243414798"/>
+      <w:bookmarkStart w:id="46" w:name="_Toc243415506"/>
       <w:r>
         <w:t>Phụ lục B. Chạy chương trình và kiểm tra kết quả hiện tại</w:t>
       </w:r>
@@ -19235,7 +19235,7 @@
         <w:pStyle w:val="Heading2"/>
         <w:jc w:val="left"/>
       </w:pPr>
-      <w:bookmarkStart w:id="47" w:name="_Toc243414799"/>
+      <w:bookmarkStart w:id="47" w:name="_Toc243415507"/>
       <w:r>
         <w:t>B.1. Chạy thuật toán và nộp Practice</w:t>
       </w:r>
@@ -19294,7 +19294,7 @@
         <w:pStyle w:val="Heading2"/>
         <w:jc w:val="left"/>
       </w:pPr>
-      <w:bookmarkStart w:id="48" w:name="_Toc243414800"/>
+      <w:bookmarkStart w:id="48" w:name="_Toc243415508"/>
       <w:r>
         <w:lastRenderedPageBreak/>
         <w:t>B.2. Đọc điểm máy chủ và đối chiếu replay</w:t>
@@ -19322,7 +19322,7 @@
         <w:pStyle w:val="Heading2"/>
         <w:jc w:val="left"/>
       </w:pPr>
-      <w:bookmarkStart w:id="49" w:name="_Toc243414801"/>
+      <w:bookmarkStart w:id="49" w:name="_Toc243415509"/>
       <w:r>
         <w:t>B.3. Các tệp liên quan đến phương pháp</w:t>
       </w:r>
@@ -19742,7 +19742,7 @@
         <w:keepLines/>
       </w:pPr>
       <w:r>
-        <w:t>Phần tạo hình có thể cần Matplotlib; phần chỉnh DOCX dùng thư viện tài liệu và Word để cập nhật mục lục, kiểm tra bố cục. Các công cụ này không nằm trong luồng lập kế hoạch khi thi. Không chạy lại các builder báo cáo lịch sử nếu muốn giữ bản DOCX hiện tại, vì chúng có thể tái tạo nội dung của một phạm vi thí nghiệm khác.</w:t>
+        <w:t>Bản nộp giữ báo cáo DOCX hoàn chỉnh, mã nguồn, bộ kiểm thử và số liệu đối chứng. Những công cụ biên soạn tài liệu tại máy không cần thiết để chạy hoặc đánh giá thuật toán nên không được đưa vào bản nộp.</w:t>
       </w:r>
     </w:p>
     <w:p>
@@ -19751,7 +19751,7 @@
         <w:spacing w:before="240"/>
         <w:jc w:val="left"/>
       </w:pPr>
-      <w:bookmarkStart w:id="50" w:name="_Toc243414802"/>
+      <w:bookmarkStart w:id="50" w:name="_Toc243415510"/>
       <w:r>
         <w:t>Phụ lục C. Thử nghiệm mở rộng với học tăng cường</w:t>
       </w:r>
@@ -19768,7 +19768,7 @@
         <w:spacing w:before="160"/>
         <w:jc w:val="left"/>
       </w:pPr>
-      <w:bookmarkStart w:id="51" w:name="_Toc243414803"/>
+      <w:bookmarkStart w:id="51" w:name="_Toc243415511"/>
       <w:r>
         <w:lastRenderedPageBreak/>
         <w:t>C.1. Câu hỏi và phạm vi thử nghiệm RL</w:t>
@@ -19786,7 +19786,7 @@
         <w:spacing w:before="160"/>
         <w:jc w:val="left"/>
       </w:pPr>
-      <w:bookmarkStart w:id="52" w:name="_Toc243414804"/>
+      <w:bookmarkStart w:id="52" w:name="_Toc243415512"/>
       <w:r>
         <w:t>C.2. PPO và kiến trúc actor critic đang sử dụng</w:t>
       </w:r>
@@ -19808,7 +19808,7 @@
         <w:spacing w:before="160"/>
         <w:jc w:val="left"/>
       </w:pPr>
-      <w:bookmarkStart w:id="53" w:name="_Toc243414805"/>
+      <w:bookmarkStart w:id="53" w:name="_Toc243415513"/>
       <w:r>
         <w:t>C.3. Vai trò của A*, masking và Greedy</w:t>
       </w:r>
@@ -20331,7 +20331,7 @@
         <w:spacing w:before="160"/>
         <w:jc w:val="left"/>
       </w:pPr>
-      <w:bookmarkStart w:id="54" w:name="_Toc243414806"/>
+      <w:bookmarkStart w:id="54" w:name="_Toc243415514"/>
       <w:r>
         <w:t>C.4. Nguồn checkpoint và quy trình suy luận</w:t>
       </w:r>
@@ -20855,7 +20855,7 @@
         <w:spacing w:before="160"/>
         <w:jc w:val="left"/>
       </w:pPr>
-      <w:bookmarkStart w:id="55" w:name="_Toc243414807"/>
+      <w:bookmarkStart w:id="55" w:name="_Toc243415515"/>
       <w:r>
         <w:t>C.5. Mục tiêu học và các giới hạn diễn giải</w:t>
       </w:r>
@@ -20881,7 +20881,7 @@
         <w:spacing w:before="160"/>
         <w:jc w:val="left"/>
       </w:pPr>
-      <w:bookmarkStart w:id="56" w:name="_Toc243414808"/>
+      <w:bookmarkStart w:id="56" w:name="_Toc243415516"/>
       <w:r>
         <w:t>C.6. Điều kiện riêng của đối chứng RL</w:t>
       </w:r>
@@ -20903,7 +20903,7 @@
         <w:spacing w:before="160"/>
         <w:jc w:val="left"/>
       </w:pPr>
-      <w:bookmarkStart w:id="57" w:name="_Toc243414809"/>
+      <w:bookmarkStart w:id="57" w:name="_Toc243415517"/>
       <w:r>
         <w:lastRenderedPageBreak/>
         <w:t>C.7. Đối chứng checkpoint RL kết hợp Greedy</w:t>
@@ -22838,7 +22838,7 @@
         <w:spacing w:before="160"/>
         <w:jc w:val="left"/>
       </w:pPr>
-      <w:bookmarkStart w:id="58" w:name="_Toc243414810"/>
+      <w:bookmarkStart w:id="58" w:name="_Toc243415518"/>
       <w:r>
         <w:t>C.8. Đối chứng hệ thống lai có chọn lại bằng heuristic</w:t>
       </w:r>
@@ -25105,7 +25105,7 @@
         <w:spacing w:before="160"/>
         <w:jc w:val="left"/>
       </w:pPr>
-      <w:bookmarkStart w:id="59" w:name="_Toc243414811"/>
+      <w:bookmarkStart w:id="59" w:name="_Toc243415519"/>
       <w:r>
         <w:t>C.9. Tái hiện thí nghiệm mở rộng</w:t>
       </w:r>
@@ -25147,7 +25147,7 @@
         <w:spacing w:before="160"/>
         <w:jc w:val="left"/>
       </w:pPr>
-      <w:bookmarkStart w:id="60" w:name="_Toc243414812"/>
+      <w:bookmarkStart w:id="60" w:name="_Toc243415520"/>
       <w:r>
         <w:t>C.10. Huấn luyện PPO và đánh giá không chọn thay bằng heuristic</w:t>
       </w:r>
@@ -29239,7 +29239,7 @@
         <w:spacing w:before="160"/>
         <w:jc w:val="left"/>
       </w:pPr>
-      <w:bookmarkStart w:id="61" w:name="_Toc243414813"/>
+      <w:bookmarkStart w:id="61" w:name="_Toc243415521"/>
       <w:r>
         <w:t>C.11. Tài liệu tham khảo riêng của phần mở rộng</w:t>
       </w:r>

</xml_diff>